<commit_message>
added all problems for invariants
</commit_message>
<xml_diff>
--- a/docs/matf78/26_27/78_invariants/matf78-2026_27-78_invariants-class2.docx
+++ b/docs/matf78/26_27/78_invariants/matf78-2026_27-78_invariants-class2.docx
@@ -2,7 +2,7 @@
 <file path=word/document.xml><?xml version="1.0" encoding="utf-8"?>
 <w:document xmlns:w="http://schemas.openxmlformats.org/wordprocessingml/2006/main" xmlns:m="http://schemas.openxmlformats.org/officeDocument/2006/math" xmlns:r="http://schemas.openxmlformats.org/officeDocument/2006/relationships" xmlns:o="urn:schemas-microsoft-com:office:office" xmlns:v="urn:schemas-microsoft-com:vml" xmlns:w10="urn:schemas-microsoft-com:office:word" xmlns:a="http://schemas.openxmlformats.org/drawingml/2006/main" xmlns:pic="http://schemas.openxmlformats.org/drawingml/2006/picture" xmlns:wp="http://schemas.openxmlformats.org/drawingml/2006/wordprocessingDrawing">
   <w:body>
-    <w:bookmarkStart w:id="13" w:name="b.-invarianti-rūtiņu-krāsojumi"/>
+    <w:bookmarkStart w:id="17" w:name="b.-invarianti-rūtiņu-krāsojumi"/>
     <w:p>
       <w:pPr>
         <w:pStyle w:val="Heading1"/>
@@ -34,114 +34,126 @@
         <w:t xml:space="preserve"> </w:t>
       </w:r>
       <w:r>
-        <w:t xml:space="preserve">Skaitļu virknes pirmais loceklis ir</w:t>
+        <w:t xml:space="preserve">No</w:t>
       </w:r>
       <w:r>
         <w:t xml:space="preserve"> </w:t>
       </w:r>
       <m:oMath>
         <m:r>
-          <m:t>12</m:t>
-        </m:r>
-      </m:oMath>
-      <w:r>
-        <w:t xml:space="preserve">. Katru nākamo iegūst iepriekšējo vai</w:t>
-      </w:r>
-      <w:r>
-        <w:t xml:space="preserve"> </w:t>
-      </w:r>
-      <w:r>
-        <w:t xml:space="preserve">nu reizinot ar</w:t>
-      </w:r>
-      <w:r>
-        <w:t xml:space="preserve"> </w:t>
-      </w:r>
-      <m:oMath>
-        <m:r>
-          <m:t>2</m:t>
-        </m:r>
-      </m:oMath>
-      <w:r>
-        <w:t xml:space="preserve"> </w:t>
-      </w:r>
-      <w:r>
-        <w:t xml:space="preserve">vai</w:t>
-      </w:r>
-      <w:r>
-        <w:t xml:space="preserve"> </w:t>
-      </w:r>
-      <m:oMath>
-        <m:r>
-          <m:t>3</m:t>
-        </m:r>
-      </m:oMath>
-      <w:r>
-        <w:t xml:space="preserve">, vai arī izdalot ar</w:t>
-      </w:r>
-      <w:r>
-        <w:t xml:space="preserve"> </w:t>
-      </w:r>
-      <m:oMath>
-        <m:r>
-          <m:t>2</m:t>
-        </m:r>
-      </m:oMath>
-      <w:r>
-        <w:t xml:space="preserve"> </w:t>
-      </w:r>
-      <w:r>
-        <w:t xml:space="preserve">vai</w:t>
-      </w:r>
-      <w:r>
-        <w:t xml:space="preserve"> </w:t>
-      </w:r>
-      <m:oMath>
-        <m:r>
-          <m:t>3</m:t>
-        </m:r>
-      </m:oMath>
-      <w:r>
-        <w:t xml:space="preserve"> </w:t>
-      </w:r>
-      <w:r>
-        <w:t xml:space="preserve">(ja dalās bez</w:t>
-      </w:r>
-      <w:r>
-        <w:t xml:space="preserve"> </w:t>
-      </w:r>
-      <w:r>
-        <w:t xml:space="preserve">atlikuma). Vai virknes</w:t>
-      </w:r>
-      <w:r>
-        <w:t xml:space="preserve"> </w:t>
-      </w:r>
-      <m:oMath>
-        <m:r>
-          <m:t>61</m:t>
+          <m:t>8</m:t>
         </m:r>
         <m:r>
           <m:rPr>
             <m:sty m:val="p"/>
           </m:rPr>
-          <m:t>.</m:t>
+          <m:t>×</m:t>
+        </m:r>
+        <m:r>
+          <m:t>8</m:t>
         </m:r>
       </m:oMath>
       <w:r>
         <w:t xml:space="preserve"> </w:t>
       </w:r>
       <w:r>
-        <w:t xml:space="preserve">loceklis var būt</w:t>
+        <w:t xml:space="preserve">kvadrāta izgriež vienu rūtiņu. Vai atlikušās</w:t>
       </w:r>
       <w:r>
         <w:t xml:space="preserve"> </w:t>
       </w:r>
       <m:oMath>
         <m:r>
-          <m:t>54</m:t>
+          <m:t>63</m:t>
         </m:r>
       </m:oMath>
       <w:r>
-        <w:t xml:space="preserve">?</w:t>
+        <w:t xml:space="preserve"> </w:t>
+      </w:r>
+      <w:r>
+        <w:t xml:space="preserve">rūtiņas var</w:t>
+      </w:r>
+      <w:r>
+        <w:t xml:space="preserve"> </w:t>
+      </w:r>
+      <w:r>
+        <w:t xml:space="preserve">sagriezt</w:t>
+      </w:r>
+      <w:r>
+        <w:t xml:space="preserve"> </w:t>
+      </w:r>
+      <m:oMath>
+        <m:r>
+          <m:t>1</m:t>
+        </m:r>
+        <m:r>
+          <m:rPr>
+            <m:sty m:val="p"/>
+          </m:rPr>
+          <m:t>×</m:t>
+        </m:r>
+        <m:r>
+          <m:t>3</m:t>
+        </m:r>
+      </m:oMath>
+      <w:r>
+        <w:t xml:space="preserve"> </w:t>
+      </w:r>
+      <w:r>
+        <w:t xml:space="preserve">taisnstūrīšos? Kur jāizgriež rūtiņa, lai varētu šādi</w:t>
+      </w:r>
+      <w:r>
+        <w:t xml:space="preserve"> </w:t>
+      </w:r>
+      <w:r>
+        <w:t xml:space="preserve">sagriezt?</w:t>
+      </w:r>
+    </w:p>
+    <w:p>
+      <w:pPr>
+        <w:pStyle w:val="BodyText"/>
+      </w:pPr>
+      <w:r>
+        <w:drawing>
+          <wp:inline>
+            <wp:extent cx="3859730" cy="1886551"/>
+            <wp:effectExtent b="0" l="0" r="0" t="0"/>
+            <wp:docPr descr="" title="" id="10" name="Picture"/>
+            <a:graphic>
+              <a:graphicData uri="http://schemas.openxmlformats.org/drawingml/2006/picture">
+                <pic:pic>
+                  <pic:nvPicPr>
+                    <pic:cNvPr descr="image05.png" id="11" name="Picture"/>
+                    <pic:cNvPicPr>
+                      <a:picLocks noChangeArrowheads="1" noChangeAspect="1"/>
+                    </pic:cNvPicPr>
+                  </pic:nvPicPr>
+                  <pic:blipFill>
+                    <a:blip r:embed="rId9"/>
+                    <a:stretch>
+                      <a:fillRect/>
+                    </a:stretch>
+                  </pic:blipFill>
+                  <pic:spPr bwMode="auto">
+                    <a:xfrm>
+                      <a:off x="0" y="0"/>
+                      <a:ext cx="3859730" cy="1886551"/>
+                    </a:xfrm>
+                    <a:prstGeom prst="rect">
+                      <a:avLst/>
+                    </a:prstGeom>
+                    <a:noFill/>
+                    <a:ln w="9525">
+                      <a:noFill/>
+                      <a:headEnd/>
+                      <a:tailEnd/>
+                    </a:ln>
+                  </pic:spPr>
+                </pic:pic>
+              </a:graphicData>
+            </a:graphic>
+          </wp:inline>
+        </w:drawing>
       </w:r>
     </w:p>
     <w:p>
@@ -157,19 +169,42 @@
           <w:i/>
           <w:iCs/>
         </w:rPr>
-        <w:t xml:space="preserve">Izpēte:</w:t>
-      </w:r>
-      <w:r>
-        <w:t xml:space="preserve"> </w:t>
-      </w:r>
-      <w:r>
-        <w:t xml:space="preserve">Uzraksti dažus pirmos locekļus. Vai pats skaitlis aug vai dilst?</w:t>
-      </w:r>
-      <w:r>
-        <w:t xml:space="preserve"> </w:t>
-      </w:r>
-      <w:r>
-        <w:t xml:space="preserve">Nē — tātad jāmeklē cits lielums.</w:t>
+        <w:t xml:space="preserve">Saprašana:</w:t>
+      </w:r>
+      <w:r>
+        <w:t xml:space="preserve"> </w:t>
+      </w:r>
+      <m:oMath>
+        <m:r>
+          <m:t>63</m:t>
+        </m:r>
+        <m:r>
+          <m:rPr>
+            <m:sty m:val="p"/>
+          </m:rPr>
+          <m:t>=</m:t>
+        </m:r>
+        <m:r>
+          <m:t>3</m:t>
+        </m:r>
+        <m:r>
+          <m:rPr>
+            <m:sty m:val="p"/>
+          </m:rPr>
+          <m:t>⋅</m:t>
+        </m:r>
+        <m:r>
+          <m:t>21</m:t>
+        </m:r>
+      </m:oMath>
+      <w:r>
+        <w:t xml:space="preserve">, tātad laukums netraucē — vajadzīgs cits</w:t>
+      </w:r>
+      <w:r>
+        <w:t xml:space="preserve"> </w:t>
+      </w:r>
+      <w:r>
+        <w:t xml:space="preserve">arguments.</w:t>
       </w:r>
     </w:p>
     <w:p>
@@ -185,27 +220,41 @@
           <w:i/>
           <w:iCs/>
         </w:rPr>
-        <w:t xml:space="preserve">Pārformulēšana:</w:t>
-      </w:r>
-      <w:r>
-        <w:t xml:space="preserve"> </w:t>
-      </w:r>
-      <w:r>
-        <w:t xml:space="preserve">Sadali pirmreizinātājos:</w:t>
+        <w:t xml:space="preserve">Izpēte:</w:t>
+      </w:r>
+      <w:r>
+        <w:t xml:space="preserve"> </w:t>
+      </w:r>
+      <w:r>
+        <w:t xml:space="preserve">Šaha krāsojums nepalīdz, jo</w:t>
       </w:r>
       <w:r>
         <w:t xml:space="preserve"> </w:t>
       </w:r>
       <m:oMath>
         <m:r>
-          <m:t>12</m:t>
+          <m:t>1</m:t>
         </m:r>
         <m:r>
           <m:rPr>
             <m:sty m:val="p"/>
           </m:rPr>
-          <m:t>=</m:t>
-        </m:r>
+          <m:t>×</m:t>
+        </m:r>
+        <m:r>
+          <m:t>3</m:t>
+        </m:r>
+      </m:oMath>
+      <w:r>
+        <w:t xml:space="preserve"> </w:t>
+      </w:r>
+      <w:r>
+        <w:t xml:space="preserve">figūra noklāj gan</w:t>
+      </w:r>
+      <w:r>
+        <w:t xml:space="preserve"> </w:t>
+      </w:r>
+      <m:oMath>
         <m:r>
           <m:t>2</m:t>
         </m:r>
@@ -213,88 +262,59 @@
           <m:rPr>
             <m:sty m:val="p"/>
           </m:rPr>
-          <m:t>⋅</m:t>
-        </m:r>
-        <m:r>
-          <m:t>2</m:t>
+          <m:t>+</m:t>
+        </m:r>
+        <m:r>
+          <m:t>1</m:t>
+        </m:r>
+      </m:oMath>
+      <w:r>
+        <w:t xml:space="preserve">,</w:t>
+      </w:r>
+      <w:r>
+        <w:t xml:space="preserve"> </w:t>
+      </w:r>
+      <w:r>
+        <w:t xml:space="preserve">gan</w:t>
+      </w:r>
+      <w:r>
+        <w:t xml:space="preserve"> </w:t>
+      </w:r>
+      <m:oMath>
+        <m:r>
+          <m:t>1</m:t>
         </m:r>
         <m:r>
           <m:rPr>
             <m:sty m:val="p"/>
           </m:rPr>
-          <m:t>⋅</m:t>
-        </m:r>
-        <m:r>
-          <m:t>3</m:t>
+          <m:t>+</m:t>
+        </m:r>
+        <m:r>
+          <m:t>2</m:t>
         </m:r>
       </m:oMath>
       <w:r>
         <w:t xml:space="preserve"> </w:t>
       </w:r>
       <w:r>
-        <w:t xml:space="preserve">(trīs</w:t>
-      </w:r>
-      <w:r>
-        <w:t xml:space="preserve"> </w:t>
-      </w:r>
-      <w:r>
-        <w:t xml:space="preserve">reizinātāji),</w:t>
-      </w:r>
-      <w:r>
-        <w:t xml:space="preserve"> </w:t>
-      </w:r>
-      <m:oMath>
-        <m:r>
-          <m:t>54</m:t>
-        </m:r>
-        <m:r>
-          <m:rPr>
-            <m:sty m:val="p"/>
-          </m:rPr>
-          <m:t>=</m:t>
-        </m:r>
-        <m:r>
-          <m:t>2</m:t>
-        </m:r>
-        <m:r>
-          <m:rPr>
-            <m:sty m:val="p"/>
-          </m:rPr>
-          <m:t>⋅</m:t>
-        </m:r>
-        <m:r>
-          <m:t>3</m:t>
-        </m:r>
-        <m:r>
-          <m:rPr>
-            <m:sty m:val="p"/>
-          </m:rPr>
-          <m:t>⋅</m:t>
-        </m:r>
-        <m:r>
-          <m:t>3</m:t>
-        </m:r>
-        <m:r>
-          <m:rPr>
-            <m:sty m:val="p"/>
-          </m:rPr>
-          <m:t>⋅</m:t>
-        </m:r>
-        <m:r>
-          <m:t>3</m:t>
-        </m:r>
-      </m:oMath>
-      <w:r>
-        <w:t xml:space="preserve"> </w:t>
-      </w:r>
-      <w:r>
-        <w:t xml:space="preserve">(četri). Par cik mainās</w:t>
-      </w:r>
-      <w:r>
-        <w:t xml:space="preserve"> </w:t>
-      </w:r>
-      <w:r>
-        <w:t xml:space="preserve">reizinātāju skaits vienā gājienā?</w:t>
+        <w:t xml:space="preserve">rūtiņas. Kāpēc der krāsojums</w:t>
+      </w:r>
+      <w:r>
+        <w:t xml:space="preserve"> </w:t>
+      </w:r>
+      <w:r>
+        <w:rPr>
+          <w:b/>
+          <w:bCs/>
+        </w:rPr>
+        <w:t xml:space="preserve">trīs</w:t>
+      </w:r>
+      <w:r>
+        <w:t xml:space="preserve"> </w:t>
+      </w:r>
+      <w:r>
+        <w:t xml:space="preserve">krāsās pa diagonālēm?</w:t>
       </w:r>
     </w:p>
     <w:p>
@@ -310,157 +330,120 @@
           <w:i/>
           <w:iCs/>
         </w:rPr>
-        <w:t xml:space="preserve">Risināšana:</w:t>
-      </w:r>
-      <w:r>
-        <w:t xml:space="preserve"> </w:t>
-      </w:r>
-      <w:r>
-        <w:t xml:space="preserve">Katrā gājienā</w:t>
+        <w:t xml:space="preserve">Pārformulēšana:</w:t>
+      </w:r>
+      <w:r>
+        <w:t xml:space="preserve"> </w:t>
+      </w:r>
+      <w:r>
+        <w:t xml:space="preserve">Katrs</w:t>
       </w:r>
       <w:r>
         <w:t xml:space="preserve"> </w:t>
       </w:r>
       <m:oMath>
+        <m:r>
+          <m:t>1</m:t>
+        </m:r>
         <m:r>
           <m:rPr>
             <m:sty m:val="p"/>
           </m:rPr>
-          <m:t>±</m:t>
-        </m:r>
-        <m:r>
-          <m:t>1</m:t>
+          <m:t>×</m:t>
+        </m:r>
+        <m:r>
+          <m:t>3</m:t>
         </m:r>
       </m:oMath>
       <w:r>
-        <w:t xml:space="preserve">, tātad reizinātāju skaita</w:t>
-      </w:r>
-      <w:r>
-        <w:t xml:space="preserve"> </w:t>
-      </w:r>
-      <w:r>
-        <w:rPr>
-          <w:b/>
-          <w:bCs/>
-        </w:rPr>
-        <w:t xml:space="preserve">paritāte</w:t>
-      </w:r>
-      <w:r>
-        <w:t xml:space="preserve"> </w:t>
-      </w:r>
-      <w:r>
-        <w:t xml:space="preserve">mainās katrā solī. No</w:t>
+        <w:t xml:space="preserve"> </w:t>
+      </w:r>
+      <w:r>
+        <w:t xml:space="preserve">taisnstūrītis noklāj tieši vienu</w:t>
       </w:r>
       <w:r>
         <w:t xml:space="preserve"> </w:t>
       </w:r>
       <m:oMath>
         <m:r>
-          <m:t>1</m:t>
-        </m:r>
-        <m:r>
-          <m:rPr>
-            <m:sty m:val="p"/>
-          </m:rPr>
-          <m:t>.</m:t>
+          <m:t>A</m:t>
         </m:r>
       </m:oMath>
       <w:r>
-        <w:t xml:space="preserve"> </w:t>
-      </w:r>
-      <w:r>
-        <w:t xml:space="preserve">līdz</w:t>
+        <w:t xml:space="preserve">,</w:t>
+      </w:r>
+      <w:r>
+        <w:t xml:space="preserve"> </w:t>
+      </w:r>
+      <w:r>
+        <w:t xml:space="preserve">vienu</w:t>
       </w:r>
       <w:r>
         <w:t xml:space="preserve"> </w:t>
       </w:r>
       <m:oMath>
         <m:r>
-          <m:t>61</m:t>
-        </m:r>
-        <m:r>
-          <m:rPr>
-            <m:sty m:val="p"/>
-          </m:rPr>
-          <m:t>.</m:t>
+          <m:t>B</m:t>
         </m:r>
       </m:oMath>
       <w:r>
         <w:t xml:space="preserve"> </w:t>
       </w:r>
       <w:r>
-        <w:t xml:space="preserve">loceklim ir</w:t>
+        <w:t xml:space="preserve">un vienu</w:t>
       </w:r>
       <w:r>
         <w:t xml:space="preserve"> </w:t>
       </w:r>
       <m:oMath>
         <m:r>
-          <m:t>60</m:t>
+          <m:t>C</m:t>
         </m:r>
       </m:oMath>
       <w:r>
         <w:t xml:space="preserve"> </w:t>
       </w:r>
       <w:r>
-        <w:t xml:space="preserve">gājieni — pāra skaits,</w:t>
-      </w:r>
-      <w:r>
-        <w:t xml:space="preserve"> </w:t>
-      </w:r>
-      <w:r>
-        <w:t xml:space="preserve">tātad</w:t>
+        <w:t xml:space="preserve">rūtiņu. Tātad invariants: noklāto</w:t>
       </w:r>
       <w:r>
         <w:t xml:space="preserve"> </w:t>
       </w:r>
       <m:oMath>
         <m:r>
-          <m:t>61</m:t>
-        </m:r>
-        <m:r>
-          <m:rPr>
-            <m:sty m:val="p"/>
-          </m:rPr>
-          <m:t>.</m:t>
+          <m:t>A</m:t>
         </m:r>
       </m:oMath>
       <w:r>
-        <w:t xml:space="preserve"> </w:t>
-      </w:r>
-      <w:r>
-        <w:t xml:space="preserve">loceklim reizinātāju skaits ir nepāra, kā</w:t>
+        <w:t xml:space="preserve">,</w:t>
       </w:r>
       <w:r>
         <w:t xml:space="preserve"> </w:t>
       </w:r>
       <m:oMath>
         <m:r>
-          <m:t>12</m:t>
+          <m:t>B</m:t>
         </m:r>
       </m:oMath>
       <w:r>
-        <w:t xml:space="preserve">. Bet</w:t>
+        <w:t xml:space="preserve"> </w:t>
+      </w:r>
+      <w:r>
+        <w:t xml:space="preserve">un</w:t>
       </w:r>
       <w:r>
         <w:t xml:space="preserve"> </w:t>
       </w:r>
       <m:oMath>
         <m:r>
-          <m:t>54</m:t>
+          <m:t>C</m:t>
         </m:r>
       </m:oMath>
       <w:r>
         <w:t xml:space="preserve"> </w:t>
       </w:r>
       <w:r>
-        <w:t xml:space="preserve">tas ir</w:t>
-      </w:r>
-      <w:r>
-        <w:t xml:space="preserve"> </w:t>
-      </w:r>
-      <w:r>
-        <w:t xml:space="preserve">pāra. Nevar.</w:t>
+        <w:t xml:space="preserve">skaitiem jābūt vienādiem.</w:t>
       </w:r>
     </w:p>
     <w:p>
@@ -476,48 +459,107 @@
           <w:i/>
           <w:iCs/>
         </w:rPr>
+        <w:t xml:space="preserve">Risināšana:</w:t>
+      </w:r>
+      <w:r>
+        <w:t xml:space="preserve"> </w:t>
+      </w:r>
+      <w:r>
+        <w:t xml:space="preserve">Saskaiti</w:t>
+      </w:r>
+      <w:r>
+        <w:t xml:space="preserve"> </w:t>
+      </w:r>
+      <m:oMath>
+        <m:r>
+          <m:t>A</m:t>
+        </m:r>
+      </m:oMath>
+      <w:r>
+        <w:t xml:space="preserve">,</w:t>
+      </w:r>
+      <w:r>
+        <w:t xml:space="preserve"> </w:t>
+      </w:r>
+      <m:oMath>
+        <m:r>
+          <m:t>B</m:t>
+        </m:r>
+      </m:oMath>
+      <w:r>
+        <w:t xml:space="preserve">,</w:t>
+      </w:r>
+      <w:r>
+        <w:t xml:space="preserve"> </w:t>
+      </w:r>
+      <m:oMath>
+        <m:r>
+          <m:t>C</m:t>
+        </m:r>
+      </m:oMath>
+      <w:r>
+        <w:t xml:space="preserve"> </w:t>
+      </w:r>
+      <w:r>
+        <w:t xml:space="preserve">rūtiņas abos attēlā dotajos krāsojumos.</w:t>
+      </w:r>
+      <w:r>
+        <w:t xml:space="preserve"> </w:t>
+      </w:r>
+      <w:r>
+        <w:t xml:space="preserve">Izgrieztajai rūtiņai jābūt tādā krāsā, kuras ir par vienu vairāk — un tas</w:t>
+      </w:r>
+      <w:r>
+        <w:t xml:space="preserve"> </w:t>
+      </w:r>
+      <w:r>
+        <w:t xml:space="preserve">jāizpildās abiem krāsojumiem vienlaikus. Kuras rūtiņas tam atbilst?</w:t>
+      </w:r>
+    </w:p>
+    <w:p>
+      <w:pPr>
+        <w:pStyle w:val="Compact"/>
+        <w:numPr>
+          <w:ilvl w:val="0"/>
+          <w:numId w:val="1001"/>
+        </w:numPr>
+      </w:pPr>
+      <w:r>
+        <w:rPr>
+          <w:i/>
+          <w:iCs/>
+        </w:rPr>
         <w:t xml:space="preserve">Atskats:</w:t>
       </w:r>
       <w:r>
         <w:t xml:space="preserve"> </w:t>
       </w:r>
       <w:r>
-        <w:t xml:space="preserve">Šeit invariants nav</w:t>
-      </w:r>
-      <w:r>
-        <w:t xml:space="preserve"> </w:t>
-      </w:r>
-      <w:r>
-        <w:t xml:space="preserve">“lielums, kas nemainās”</w:t>
-      </w:r>
-      <w:r>
-        <w:t xml:space="preserve">, bet</w:t>
-      </w:r>
-      <w:r>
-        <w:t xml:space="preserve"> </w:t>
-      </w:r>
-      <w:r>
-        <w:t xml:space="preserve">“lielums, kas</w:t>
-      </w:r>
-      <w:r>
-        <w:t xml:space="preserve"> </w:t>
-      </w:r>
-      <w:r>
-        <w:t xml:space="preserve">mainās pilnīgi regulāri”</w:t>
-      </w:r>
-      <w:r>
-        <w:t xml:space="preserve">. Kāds ir vispārīgais secinājums par</w:t>
-      </w:r>
-      <w:r>
-        <w:t xml:space="preserve"> </w:t>
-      </w:r>
-      <m:oMath>
-        <m:r>
-          <m:t>n</m:t>
-        </m:r>
-      </m:oMath>
-      <w:r>
-        <w:t xml:space="preserve">-to locekli?</w:t>
+        <w:t xml:space="preserve">Uzdevumā ir divas daļas:</w:t>
+      </w:r>
+      <w:r>
+        <w:t xml:space="preserve"> </w:t>
+      </w:r>
+      <w:r>
+        <w:t xml:space="preserve">“kur var”</w:t>
+      </w:r>
+      <w:r>
+        <w:t xml:space="preserve"> </w:t>
+      </w:r>
+      <w:r>
+        <w:t xml:space="preserve">(piemērs) un</w:t>
+      </w:r>
+      <w:r>
+        <w:t xml:space="preserve"> </w:t>
+      </w:r>
+      <w:r>
+        <w:t xml:space="preserve">“citur nevar”</w:t>
+      </w:r>
+      <w:r>
+        <w:t xml:space="preserve"> </w:t>
+      </w:r>
+      <w:r>
+        <w:t xml:space="preserve">(invariants). Vai atbildē ir abas?</w:t>
       </w:r>
     </w:p>
     <w:p>
@@ -531,129 +573,87 @@
         </w:rPr>
         <w:t xml:space="preserve">2.piemērs:</w:t>
       </w:r>
+      <w:r>
+        <w:t xml:space="preserve"> </w:t>
+      </w:r>
+      <w:r>
+        <w:t xml:space="preserve">Vai taisnstūri ar izmēriem</w:t>
+      </w:r>
+      <w:r>
+        <w:t xml:space="preserve"> </w:t>
+      </w:r>
+      <m:oMath>
+        <m:r>
+          <m:t>7</m:t>
+        </m:r>
+        <m:r>
+          <m:rPr>
+            <m:sty m:val="p"/>
+          </m:rPr>
+          <m:t>×</m:t>
+        </m:r>
+        <m:r>
+          <m:t>6</m:t>
+        </m:r>
+      </m:oMath>
+      <w:r>
+        <w:t xml:space="preserve"> </w:t>
+      </w:r>
+      <w:r>
+        <w:t xml:space="preserve">rūtiņas var pārklāt ar 4.att.</w:t>
+      </w:r>
+      <w:r>
+        <w:t xml:space="preserve"> </w:t>
+      </w:r>
+      <w:r>
+        <w:t xml:space="preserve">redzamajām figūrām?</w:t>
+      </w:r>
     </w:p>
     <w:p>
       <w:pPr>
         <w:pStyle w:val="BodyText"/>
       </w:pPr>
       <w:r>
-        <w:t xml:space="preserve">Kastē atrodas baltas, sarkanas un zaļas lodītes. Ar vienu gājienu var izņemt</w:t>
-      </w:r>
-      <w:r>
-        <w:t xml:space="preserve"> </w:t>
-      </w:r>
-      <w:r>
-        <w:t xml:space="preserve">divas dažādu krāsu lodītes un ielikt vienu trešās krāsas lodīti. Vai var</w:t>
-      </w:r>
-      <w:r>
-        <w:t xml:space="preserve"> </w:t>
-      </w:r>
-      <w:r>
-        <w:t xml:space="preserve">panākt, ka paliek tikai viena lodīte, ja sākumā ir</w:t>
-      </w:r>
-      <w:r>
-        <w:t xml:space="preserve"> </w:t>
-      </w:r>
-      <w:r>
-        <w:rPr>
-          <w:b/>
-          <w:bCs/>
-        </w:rPr>
-        <w:t xml:space="preserve">(A)</w:t>
-      </w:r>
-      <w:r>
-        <w:t xml:space="preserve"> </w:t>
-      </w:r>
-      <m:oMath>
-        <m:r>
-          <m:t>10</m:t>
-        </m:r>
-      </m:oMath>
-      <w:r>
-        <w:t xml:space="preserve"> </w:t>
-      </w:r>
-      <w:r>
-        <w:t xml:space="preserve">baltas,</w:t>
-      </w:r>
-      <w:r>
-        <w:t xml:space="preserve"> </w:t>
-      </w:r>
-      <m:oMath>
-        <m:r>
-          <m:t>12</m:t>
-        </m:r>
-      </m:oMath>
-      <w:r>
-        <w:t xml:space="preserve"> </w:t>
-      </w:r>
-      <w:r>
-        <w:t xml:space="preserve">sarkanas,</w:t>
-      </w:r>
-      <w:r>
-        <w:t xml:space="preserve"> </w:t>
-      </w:r>
-      <m:oMath>
-        <m:r>
-          <m:t>16</m:t>
-        </m:r>
-      </m:oMath>
-      <w:r>
-        <w:t xml:space="preserve"> </w:t>
-      </w:r>
-      <w:r>
-        <w:t xml:space="preserve">zaļas;</w:t>
-      </w:r>
-      <w:r>
-        <w:t xml:space="preserve"> </w:t>
-      </w:r>
-      <w:r>
-        <w:rPr>
-          <w:b/>
-          <w:bCs/>
-        </w:rPr>
-        <w:t xml:space="preserve">(B)</w:t>
-      </w:r>
-      <w:r>
-        <w:t xml:space="preserve"> </w:t>
-      </w:r>
-      <m:oMath>
-        <m:r>
-          <m:t>10</m:t>
-        </m:r>
-      </m:oMath>
-      <w:r>
-        <w:t xml:space="preserve"> </w:t>
-      </w:r>
-      <w:r>
-        <w:t xml:space="preserve">baltas,</w:t>
-      </w:r>
-      <w:r>
-        <w:t xml:space="preserve"> </w:t>
-      </w:r>
-      <m:oMath>
-        <m:r>
-          <m:t>12</m:t>
-        </m:r>
-      </m:oMath>
-      <w:r>
-        <w:t xml:space="preserve"> </w:t>
-      </w:r>
-      <w:r>
-        <w:t xml:space="preserve">sarkanas,</w:t>
-      </w:r>
-      <w:r>
-        <w:t xml:space="preserve"> </w:t>
-      </w:r>
-      <m:oMath>
-        <m:r>
-          <m:t>15</m:t>
-        </m:r>
-      </m:oMath>
-      <w:r>
-        <w:t xml:space="preserve"> </w:t>
-      </w:r>
-      <w:r>
-        <w:t xml:space="preserve">zaļas?</w:t>
+        <w:drawing>
+          <wp:inline>
+            <wp:extent cx="3390900" cy="1066800"/>
+            <wp:effectExtent b="0" l="0" r="0" t="0"/>
+            <wp:docPr descr="" title="" id="13" name="Picture"/>
+            <a:graphic>
+              <a:graphicData uri="http://schemas.openxmlformats.org/drawingml/2006/picture">
+                <pic:pic>
+                  <pic:nvPicPr>
+                    <pic:cNvPr descr="LV.AMO.2015.7.2.png" id="14" name="Picture"/>
+                    <pic:cNvPicPr>
+                      <a:picLocks noChangeArrowheads="1" noChangeAspect="1"/>
+                    </pic:cNvPicPr>
+                  </pic:nvPicPr>
+                  <pic:blipFill>
+                    <a:blip r:embed="rId12"/>
+                    <a:stretch>
+                      <a:fillRect/>
+                    </a:stretch>
+                  </pic:blipFill>
+                  <pic:spPr bwMode="auto">
+                    <a:xfrm>
+                      <a:off x="0" y="0"/>
+                      <a:ext cx="3390900" cy="1066800"/>
+                    </a:xfrm>
+                    <a:prstGeom prst="rect">
+                      <a:avLst/>
+                    </a:prstGeom>
+                    <a:noFill/>
+                    <a:ln w="9525">
+                      <a:noFill/>
+                      <a:headEnd/>
+                      <a:tailEnd/>
+                    </a:ln>
+                  </pic:spPr>
+                </pic:pic>
+              </a:graphicData>
+            </a:graphic>
+          </wp:inline>
+        </w:drawing>
       </w:r>
     </w:p>
     <w:p>
@@ -675,13 +675,31 @@
         <w:t xml:space="preserve"> </w:t>
       </w:r>
       <w:r>
-        <w:t xml:space="preserve">Divas daļas — atbildes var būt dažādas, un katrai vajag savu</w:t>
-      </w:r>
-      <w:r>
-        <w:t xml:space="preserve"> </w:t>
-      </w:r>
-      <w:r>
-        <w:t xml:space="preserve">pamatojuma veidu.</w:t>
+        <w:t xml:space="preserve">“Vai var”</w:t>
+      </w:r>
+      <w:r>
+        <w:t xml:space="preserve"> </w:t>
+      </w:r>
+      <w:r>
+        <w:t xml:space="preserve">ar sagaidāmo atbildi</w:t>
+      </w:r>
+      <w:r>
+        <w:t xml:space="preserve"> </w:t>
+      </w:r>
+      <w:r>
+        <w:t xml:space="preserve">“nē”</w:t>
+      </w:r>
+      <w:r>
+        <w:t xml:space="preserve"> </w:t>
+      </w:r>
+      <w:r>
+        <w:t xml:space="preserve">— vajag spriedumu par visiem</w:t>
+      </w:r>
+      <w:r>
+        <w:t xml:space="preserve"> </w:t>
+      </w:r>
+      <w:r>
+        <w:t xml:space="preserve">iespējamiem pārklājumiem uzreiz.</w:t>
       </w:r>
     </w:p>
     <w:p>
@@ -703,104 +721,48 @@
         <w:t xml:space="preserve"> </w:t>
       </w:r>
       <w:r>
-        <w:t xml:space="preserve">Viens gājiens: divi skaiti</w:t>
+        <w:t xml:space="preserve">Nokrāso taisnstūri šaha galdiņa veidā un saskaiti melnās rūtiņas:</w:t>
       </w:r>
       <w:r>
         <w:t xml:space="preserve"> </w:t>
       </w:r>
       <m:oMath>
+        <m:r>
+          <m:t>7</m:t>
+        </m:r>
         <m:r>
           <m:rPr>
             <m:sty m:val="p"/>
           </m:rPr>
-          <m:t>−</m:t>
-        </m:r>
-        <m:r>
-          <m:t>1</m:t>
-        </m:r>
-      </m:oMath>
-      <w:r>
-        <w:t xml:space="preserve">, viens skaits</w:t>
-      </w:r>
-      <w:r>
-        <w:t xml:space="preserve"> </w:t>
-      </w:r>
-      <m:oMath>
+          <m:t>⋅</m:t>
+        </m:r>
+        <m:r>
+          <m:t>6</m:t>
+        </m:r>
         <m:r>
           <m:rPr>
             <m:sty m:val="p"/>
           </m:rPr>
-          <m:t>+</m:t>
-        </m:r>
-        <m:r>
-          <m:t>1</m:t>
+          <m:t>:</m:t>
+        </m:r>
+        <m:r>
+          <m:t>2</m:t>
+        </m:r>
+        <m:r>
+          <m:rPr>
+            <m:sty m:val="p"/>
+          </m:rPr>
+          <m:t>=</m:t>
+        </m:r>
+        <m:r>
+          <m:t>21</m:t>
         </m:r>
       </m:oMath>
       <w:r>
-        <w:t xml:space="preserve">. Tātad</w:t>
-      </w:r>
-      <w:r>
-        <w:t xml:space="preserve"> </w:t>
-      </w:r>
-      <w:r>
-        <w:rPr>
-          <w:b/>
-          <w:bCs/>
-        </w:rPr>
-        <w:t xml:space="preserve">visas</w:t>
-      </w:r>
-      <w:r>
-        <w:rPr>
-          <w:b/>
-          <w:bCs/>
-        </w:rPr>
-        <w:t xml:space="preserve"> </w:t>
-      </w:r>
-      <w:r>
-        <w:rPr>
-          <w:b/>
-          <w:bCs/>
-        </w:rPr>
-        <w:t xml:space="preserve">trīs</w:t>
-      </w:r>
-      <w:r>
-        <w:t xml:space="preserve"> </w:t>
-      </w:r>
-      <w:r>
-        <w:t xml:space="preserve">paritātes mainās vienlaikus. Kas tad paliek nemainīgs? Jebkuru divu</w:t>
-      </w:r>
-      <w:r>
-        <w:t xml:space="preserve"> </w:t>
-      </w:r>
-      <w:r>
-        <w:t xml:space="preserve">skaitu</w:t>
-      </w:r>
-      <w:r>
-        <w:t xml:space="preserve"> </w:t>
-      </w:r>
-      <w:r>
-        <w:rPr>
-          <w:b/>
-          <w:bCs/>
-        </w:rPr>
-        <w:t xml:space="preserve">starpība</w:t>
-      </w:r>
-      <w:r>
-        <w:t xml:space="preserve"> </w:t>
-      </w:r>
-      <w:r>
-        <w:t xml:space="preserve">pēc moduļa</w:t>
-      </w:r>
-      <w:r>
-        <w:t xml:space="preserve"> </w:t>
-      </w:r>
-      <m:oMath>
-        <m:r>
-          <m:t>2</m:t>
-        </m:r>
-      </m:oMath>
-      <w:r>
-        <w:t xml:space="preserve">.</w:t>
+        <w:t xml:space="preserve"> </w:t>
+      </w:r>
+      <w:r>
+        <w:t xml:space="preserve">— nepāra skaits.</w:t>
       </w:r>
     </w:p>
     <w:p>
@@ -816,63 +778,35 @@
           <w:i/>
           <w:iCs/>
         </w:rPr>
-        <w:t xml:space="preserve">Risināšana (A):</w:t>
-      </w:r>
-      <w:r>
-        <w:t xml:space="preserve"> </w:t>
-      </w:r>
-      <w:r>
-        <w:t xml:space="preserve">Sākumā visi trīs skaiti pāra — visas starpības pāra. Beigu</w:t>
-      </w:r>
-      <w:r>
-        <w:t xml:space="preserve"> </w:t>
-      </w:r>
-      <w:r>
-        <w:t xml:space="preserve">stāvoklī</w:t>
-      </w:r>
-      <w:r>
-        <w:t xml:space="preserve"> </w:t>
-      </w:r>
-      <m:oMath>
-        <m:r>
-          <m:rPr>
-            <m:sty m:val="p"/>
-          </m:rPr>
-          <m:t>(</m:t>
-        </m:r>
-        <m:r>
-          <m:t>1</m:t>
-        </m:r>
-        <m:r>
-          <m:rPr>
-            <m:sty m:val="p"/>
-          </m:rPr>
-          <m:t>,</m:t>
-        </m:r>
-        <m:r>
-          <m:t>0</m:t>
-        </m:r>
-        <m:r>
-          <m:rPr>
-            <m:sty m:val="p"/>
-          </m:rPr>
-          <m:t>,</m:t>
-        </m:r>
-        <m:r>
-          <m:t>0</m:t>
-        </m:r>
-        <m:r>
-          <m:rPr>
-            <m:sty m:val="p"/>
-          </m:rPr>
-          <m:t>)</m:t>
-        </m:r>
-      </m:oMath>
-      <w:r>
-        <w:t xml:space="preserve"> </w:t>
-      </w:r>
-      <w:r>
-        <w:t xml:space="preserve">divas starpības ir nepāra. Pretruna, tātad nevar.</w:t>
+        <w:t xml:space="preserve">Izpēte:</w:t>
+      </w:r>
+      <w:r>
+        <w:t xml:space="preserve"> </w:t>
+      </w:r>
+      <w:r>
+        <w:t xml:space="preserve">Katrai figūrai pārbaudi visus pagriezienus un spoguļattēlus: cik</w:t>
+      </w:r>
+      <w:r>
+        <w:t xml:space="preserve"> </w:t>
+      </w:r>
+      <w:r>
+        <w:t xml:space="preserve">melnas rūtiņas tā noklāj? Katru reizi sanāk</w:t>
+      </w:r>
+      <w:r>
+        <w:t xml:space="preserve"> </w:t>
+      </w:r>
+      <w:r>
+        <w:rPr>
+          <w:b/>
+          <w:bCs/>
+        </w:rPr>
+        <w:t xml:space="preserve">pāra</w:t>
+      </w:r>
+      <w:r>
+        <w:t xml:space="preserve"> </w:t>
+      </w:r>
+      <w:r>
+        <w:t xml:space="preserve">skaits.</w:t>
       </w:r>
     </w:p>
     <w:p>
@@ -888,228 +822,33 @@
           <w:i/>
           <w:iCs/>
         </w:rPr>
-        <w:t xml:space="preserve">Risināšana (B):</w:t>
-      </w:r>
-      <w:r>
-        <w:t xml:space="preserve"> </w:t>
-      </w:r>
-      <w:r>
-        <w:t xml:space="preserve">Paritātes</w:t>
+        <w:t xml:space="preserve">Risināšana:</w:t>
+      </w:r>
+      <w:r>
+        <w:t xml:space="preserve"> </w:t>
+      </w:r>
+      <w:r>
+        <w:t xml:space="preserve">Vairāku pāra skaitļu summa ir pāra, bet melno rūtiņu kopskaits</w:t>
+      </w:r>
+      <w:r>
+        <w:t xml:space="preserve"> </w:t>
+      </w:r>
+      <w:r>
+        <w:t xml:space="preserve">ir</w:t>
       </w:r>
       <w:r>
         <w:t xml:space="preserve"> </w:t>
       </w:r>
       <m:oMath>
         <m:r>
-          <m:rPr>
-            <m:sty m:val="p"/>
-          </m:rPr>
-          <m:t>(</m:t>
-        </m:r>
-        <m:r>
-          <m:rPr>
-            <m:nor/>
-            <m:sty m:val="p"/>
-          </m:rPr>
-          <m:t>p</m:t>
-        </m:r>
-        <m:r>
-          <m:rPr>
-            <m:sty m:val="p"/>
-          </m:rPr>
-          <m:t>,</m:t>
-        </m:r>
-        <m:r>
-          <m:rPr>
-            <m:nor/>
-            <m:sty m:val="p"/>
-          </m:rPr>
-          <m:t>p</m:t>
-        </m:r>
-        <m:r>
-          <m:rPr>
-            <m:sty m:val="p"/>
-          </m:rPr>
-          <m:t>,</m:t>
-        </m:r>
-        <m:r>
-          <m:rPr>
-            <m:nor/>
-            <m:sty m:val="p"/>
-          </m:rPr>
-          <m:t>n</m:t>
-        </m:r>
-        <m:r>
-          <m:rPr>
-            <m:sty m:val="p"/>
-          </m:rPr>
-          <m:t>)</m:t>
+          <m:t>21</m:t>
         </m:r>
       </m:oMath>
       <w:r>
         <w:t xml:space="preserve"> </w:t>
       </w:r>
       <w:r>
-        <w:t xml:space="preserve">neizslēdz</w:t>
-      </w:r>
-      <w:r>
-        <w:t xml:space="preserve"> </w:t>
-      </w:r>
-      <w:r>
-        <w:t xml:space="preserve">rezultātu</w:t>
-      </w:r>
-      <w:r>
-        <w:t xml:space="preserve"> </w:t>
-      </w:r>
-      <m:oMath>
-        <m:r>
-          <m:rPr>
-            <m:sty m:val="p"/>
-          </m:rPr>
-          <m:t>(</m:t>
-        </m:r>
-        <m:r>
-          <m:t>0</m:t>
-        </m:r>
-        <m:r>
-          <m:rPr>
-            <m:sty m:val="p"/>
-          </m:rPr>
-          <m:t>,</m:t>
-        </m:r>
-        <m:r>
-          <m:t>0</m:t>
-        </m:r>
-        <m:r>
-          <m:rPr>
-            <m:sty m:val="p"/>
-          </m:rPr>
-          <m:t>,</m:t>
-        </m:r>
-        <m:r>
-          <m:t>1</m:t>
-        </m:r>
-        <m:r>
-          <m:rPr>
-            <m:sty m:val="p"/>
-          </m:rPr>
-          <m:t>)</m:t>
-        </m:r>
-      </m:oMath>
-      <w:r>
-        <w:t xml:space="preserve"> </w:t>
-      </w:r>
-      <w:r>
-        <w:t xml:space="preserve">— bet tas vēl nenozīmē, ka var! Jāuzrāda gājienu virkne:</w:t>
-      </w:r>
-      <w:r>
-        <w:t xml:space="preserve"> </w:t>
-      </w:r>
-      <w:r>
-        <w:t xml:space="preserve">trīs gājieni</w:t>
-      </w:r>
-      <w:r>
-        <w:t xml:space="preserve"> </w:t>
-      </w:r>
-      <w:r>
-        <w:rPr>
-          <w:i/>
-          <w:iCs/>
-        </w:rPr>
-        <w:t xml:space="preserve">bs</w:t>
-      </w:r>
-      <w:r>
-        <w:t xml:space="preserve">,</w:t>
-      </w:r>
-      <w:r>
-        <w:t xml:space="preserve"> </w:t>
-      </w:r>
-      <w:r>
-        <w:rPr>
-          <w:i/>
-          <w:iCs/>
-        </w:rPr>
-        <w:t xml:space="preserve">bz</w:t>
-      </w:r>
-      <w:r>
-        <w:t xml:space="preserve">,</w:t>
-      </w:r>
-      <w:r>
-        <w:t xml:space="preserve"> </w:t>
-      </w:r>
-      <w:r>
-        <w:rPr>
-          <w:i/>
-          <w:iCs/>
-        </w:rPr>
-        <w:t xml:space="preserve">sz</w:t>
-      </w:r>
-      <w:r>
-        <w:t xml:space="preserve"> </w:t>
-      </w:r>
-      <w:r>
-        <w:t xml:space="preserve">samazina visus trīs skaitus par</w:t>
-      </w:r>
-      <w:r>
-        <w:t xml:space="preserve"> </w:t>
-      </w:r>
-      <m:oMath>
-        <m:r>
-          <m:t>1</m:t>
-        </m:r>
-      </m:oMath>
-      <w:r>
-        <w:t xml:space="preserve">; ar tiem</w:t>
-      </w:r>
-      <w:r>
-        <w:t xml:space="preserve"> </w:t>
-      </w:r>
-      <w:r>
-        <w:t xml:space="preserve">nonāk pie</w:t>
-      </w:r>
-      <w:r>
-        <w:t xml:space="preserve"> </w:t>
-      </w:r>
-      <m:oMath>
-        <m:r>
-          <m:rPr>
-            <m:sty m:val="p"/>
-          </m:rPr>
-          <m:t>(</m:t>
-        </m:r>
-        <m:r>
-          <m:t>1</m:t>
-        </m:r>
-        <m:r>
-          <m:rPr>
-            <m:sty m:val="p"/>
-          </m:rPr>
-          <m:t>,</m:t>
-        </m:r>
-        <m:r>
-          <m:t>3</m:t>
-        </m:r>
-        <m:r>
-          <m:rPr>
-            <m:sty m:val="p"/>
-          </m:rPr>
-          <m:t>,</m:t>
-        </m:r>
-        <m:r>
-          <m:t>6</m:t>
-        </m:r>
-        <m:r>
-          <m:rPr>
-            <m:sty m:val="p"/>
-          </m:rPr>
-          <m:t>)</m:t>
-        </m:r>
-      </m:oMath>
-      <w:r>
-        <w:t xml:space="preserve"> </w:t>
-      </w:r>
-      <w:r>
-        <w:t xml:space="preserve">un tālāk pabeidz ar rokām.</w:t>
+        <w:t xml:space="preserve">— nepāra. Pretruna.</w:t>
       </w:r>
     </w:p>
     <w:p>
@@ -1131,55 +870,13 @@
         <w:t xml:space="preserve"> </w:t>
       </w:r>
       <w:r>
-        <w:t xml:space="preserve">Formulē vienā teikumā, kāpēc invariants nekad nevar pierādīt</w:t>
-      </w:r>
-      <w:r>
-        <w:t xml:space="preserve"> </w:t>
-      </w:r>
-      <w:r>
-        <w:t xml:space="preserve">“jā”</w:t>
-      </w:r>
-      <w:r>
-        <w:t xml:space="preserve">.</w:t>
-      </w:r>
-    </w:p>
-    <w:bookmarkStart w:id="9" w:name="X50510963a79e4ab2322cfc54b27beb90fb2b105"/>
-    <w:p>
-      <w:pPr>
-        <w:pStyle w:val="Heading4"/>
-      </w:pPr>
-      <w:r>
-        <w:t xml:space="preserve">1.2. LV.NOL.2023.7.5 — kad invarianta vien nepietiek</w:t>
-      </w:r>
-    </w:p>
-    <w:p>
-      <w:pPr>
-        <w:pStyle w:val="FirstParagraph"/>
-      </w:pPr>
-      <w:r>
-        <w:t xml:space="preserve">Kastē atrodas baltas, sarkanas un zaļas lodītes. Ar vienu gājienu var izņemt</w:t>
-      </w:r>
-      <w:r>
-        <w:t xml:space="preserve"> </w:t>
-      </w:r>
-      <w:r>
-        <w:t xml:space="preserve">divas dažādu krāsu lodītes un ielikt vienu trešās krāsas lodīti. Vai var</w:t>
-      </w:r>
-      <w:r>
-        <w:t xml:space="preserve"> </w:t>
-      </w:r>
-      <w:r>
-        <w:t xml:space="preserve">panākt, ka paliek tikai viena lodīte, ja sākumā ir</w:t>
-      </w:r>
-      <w:r>
-        <w:t xml:space="preserve"> </w:t>
-      </w:r>
-      <w:r>
-        <w:rPr>
-          <w:b/>
-          <w:bCs/>
-        </w:rPr>
-        <w:t xml:space="preserve">(A)</w:t>
+        <w:t xml:space="preserve">Piezīme risinājumā: der arī krāsojums joslās. Pārbaudi, vai ar to</w:t>
+      </w:r>
+      <w:r>
+        <w:t xml:space="preserve"> </w:t>
+      </w:r>
+      <w:r>
+        <w:t xml:space="preserve">sanāk tas pats. Kāpēc šis pats spriedums bez izmaiņām strādā arī</w:t>
       </w:r>
       <w:r>
         <w:t xml:space="preserve"> </w:t>
@@ -1188,589 +885,21 @@
         <m:r>
           <m:t>10</m:t>
         </m:r>
-      </m:oMath>
-      <w:r>
-        <w:t xml:space="preserve"> </w:t>
-      </w:r>
-      <w:r>
-        <w:t xml:space="preserve">baltas,</w:t>
-      </w:r>
-      <w:r>
-        <w:t xml:space="preserve"> </w:t>
-      </w:r>
-      <m:oMath>
-        <m:r>
-          <m:t>12</m:t>
-        </m:r>
-      </m:oMath>
-      <w:r>
-        <w:t xml:space="preserve"> </w:t>
-      </w:r>
-      <w:r>
-        <w:t xml:space="preserve">sarkanas,</w:t>
-      </w:r>
-      <w:r>
-        <w:t xml:space="preserve"> </w:t>
-      </w:r>
-      <m:oMath>
-        <m:r>
-          <m:t>16</m:t>
-        </m:r>
-      </m:oMath>
-      <w:r>
-        <w:t xml:space="preserve"> </w:t>
-      </w:r>
-      <w:r>
-        <w:t xml:space="preserve">zaļas;</w:t>
-      </w:r>
-      <w:r>
-        <w:t xml:space="preserve"> </w:t>
-      </w:r>
-      <w:r>
-        <w:rPr>
-          <w:b/>
-          <w:bCs/>
-        </w:rPr>
-        <w:t xml:space="preserve">(B)</w:t>
-      </w:r>
-      <w:r>
-        <w:t xml:space="preserve"> </w:t>
-      </w:r>
-      <m:oMath>
-        <m:r>
-          <m:t>10</m:t>
-        </m:r>
-      </m:oMath>
-      <w:r>
-        <w:t xml:space="preserve"> </w:t>
-      </w:r>
-      <w:r>
-        <w:t xml:space="preserve">baltas,</w:t>
-      </w:r>
-      <w:r>
-        <w:t xml:space="preserve"> </w:t>
-      </w:r>
-      <m:oMath>
-        <m:r>
-          <m:t>12</m:t>
-        </m:r>
-      </m:oMath>
-      <w:r>
-        <w:t xml:space="preserve"> </w:t>
-      </w:r>
-      <w:r>
-        <w:t xml:space="preserve">sarkanas,</w:t>
-      </w:r>
-      <w:r>
-        <w:t xml:space="preserve"> </w:t>
-      </w:r>
-      <m:oMath>
-        <m:r>
-          <m:t>15</m:t>
-        </m:r>
-      </m:oMath>
-      <w:r>
-        <w:t xml:space="preserve"> </w:t>
-      </w:r>
-      <w:r>
-        <w:t xml:space="preserve">zaļas?</w:t>
-      </w:r>
-    </w:p>
-    <w:p>
-      <w:pPr>
-        <w:pStyle w:val="Compact"/>
-        <w:numPr>
-          <w:ilvl w:val="0"/>
-          <w:numId w:val="1003"/>
-        </w:numPr>
-      </w:pPr>
-      <w:r>
-        <w:rPr>
-          <w:i/>
-          <w:iCs/>
-        </w:rPr>
-        <w:t xml:space="preserve">Saprašana:</w:t>
-      </w:r>
-      <w:r>
-        <w:t xml:space="preserve"> </w:t>
-      </w:r>
-      <w:r>
-        <w:t xml:space="preserve">Divas daļas — atbildes var būt dažādas, un katrai vajag savu</w:t>
-      </w:r>
-      <w:r>
-        <w:t xml:space="preserve"> </w:t>
-      </w:r>
-      <w:r>
-        <w:t xml:space="preserve">pamatojuma veidu.</w:t>
-      </w:r>
-    </w:p>
-    <w:p>
-      <w:pPr>
-        <w:pStyle w:val="Compact"/>
-        <w:numPr>
-          <w:ilvl w:val="0"/>
-          <w:numId w:val="1003"/>
-        </w:numPr>
-      </w:pPr>
-      <w:r>
-        <w:rPr>
-          <w:i/>
-          <w:iCs/>
-        </w:rPr>
-        <w:t xml:space="preserve">Izpēte:</w:t>
-      </w:r>
-      <w:r>
-        <w:t xml:space="preserve"> </w:t>
-      </w:r>
-      <w:r>
-        <w:t xml:space="preserve">Viens gājiens: divi skaiti</w:t>
-      </w:r>
-      <w:r>
-        <w:t xml:space="preserve"> </w:t>
-      </w:r>
-      <m:oMath>
         <m:r>
           <m:rPr>
             <m:sty m:val="p"/>
           </m:rPr>
-          <m:t>−</m:t>
-        </m:r>
-        <m:r>
-          <m:t>1</m:t>
+          <m:t>×</m:t>
+        </m:r>
+        <m:r>
+          <m:t>9</m:t>
         </m:r>
       </m:oMath>
       <w:r>
-        <w:t xml:space="preserve">, viens skaits</w:t>
-      </w:r>
-      <w:r>
-        <w:t xml:space="preserve"> </w:t>
-      </w:r>
-      <m:oMath>
-        <m:r>
-          <m:rPr>
-            <m:sty m:val="p"/>
-          </m:rPr>
-          <m:t>+</m:t>
-        </m:r>
-        <m:r>
-          <m:t>1</m:t>
-        </m:r>
-      </m:oMath>
-      <w:r>
-        <w:t xml:space="preserve">. Tātad</w:t>
-      </w:r>
-      <w:r>
-        <w:t xml:space="preserve"> </w:t>
-      </w:r>
-      <w:r>
-        <w:rPr>
-          <w:b/>
-          <w:bCs/>
-        </w:rPr>
-        <w:t xml:space="preserve">visas</w:t>
-      </w:r>
-      <w:r>
-        <w:rPr>
-          <w:b/>
-          <w:bCs/>
-        </w:rPr>
-        <w:t xml:space="preserve"> </w:t>
-      </w:r>
-      <w:r>
-        <w:rPr>
-          <w:b/>
-          <w:bCs/>
-        </w:rPr>
-        <w:t xml:space="preserve">trīs</w:t>
-      </w:r>
-      <w:r>
-        <w:t xml:space="preserve"> </w:t>
-      </w:r>
-      <w:r>
-        <w:t xml:space="preserve">paritātes mainās vienlaikus. Kas tad paliek nemainīgs? Jebkuru divu</w:t>
-      </w:r>
-      <w:r>
-        <w:t xml:space="preserve"> </w:t>
-      </w:r>
-      <w:r>
-        <w:t xml:space="preserve">skaitu</w:t>
-      </w:r>
-      <w:r>
-        <w:t xml:space="preserve"> </w:t>
-      </w:r>
-      <w:r>
-        <w:rPr>
-          <w:b/>
-          <w:bCs/>
-        </w:rPr>
-        <w:t xml:space="preserve">starpība</w:t>
-      </w:r>
-      <w:r>
-        <w:t xml:space="preserve"> </w:t>
-      </w:r>
-      <w:r>
-        <w:t xml:space="preserve">pēc moduļa</w:t>
-      </w:r>
-      <w:r>
-        <w:t xml:space="preserve"> </w:t>
-      </w:r>
-      <m:oMath>
-        <m:r>
-          <m:t>2</m:t>
-        </m:r>
-      </m:oMath>
-      <w:r>
-        <w:t xml:space="preserve">.</w:t>
-      </w:r>
-    </w:p>
-    <w:p>
-      <w:pPr>
-        <w:pStyle w:val="Compact"/>
-        <w:numPr>
-          <w:ilvl w:val="0"/>
-          <w:numId w:val="1003"/>
-        </w:numPr>
-      </w:pPr>
-      <w:r>
-        <w:rPr>
-          <w:i/>
-          <w:iCs/>
-        </w:rPr>
-        <w:t xml:space="preserve">Risināšana (A):</w:t>
-      </w:r>
-      <w:r>
-        <w:t xml:space="preserve"> </w:t>
-      </w:r>
-      <w:r>
-        <w:t xml:space="preserve">Sākumā visi trīs skaiti pāra — visas starpības pāra. Beigu</w:t>
-      </w:r>
-      <w:r>
-        <w:t xml:space="preserve"> </w:t>
-      </w:r>
-      <w:r>
-        <w:t xml:space="preserve">stāvoklī</w:t>
-      </w:r>
-      <w:r>
-        <w:t xml:space="preserve"> </w:t>
-      </w:r>
-      <m:oMath>
-        <m:r>
-          <m:rPr>
-            <m:sty m:val="p"/>
-          </m:rPr>
-          <m:t>(</m:t>
-        </m:r>
-        <m:r>
-          <m:t>1</m:t>
-        </m:r>
-        <m:r>
-          <m:rPr>
-            <m:sty m:val="p"/>
-          </m:rPr>
-          <m:t>,</m:t>
-        </m:r>
-        <m:r>
-          <m:t>0</m:t>
-        </m:r>
-        <m:r>
-          <m:rPr>
-            <m:sty m:val="p"/>
-          </m:rPr>
-          <m:t>,</m:t>
-        </m:r>
-        <m:r>
-          <m:t>0</m:t>
-        </m:r>
-        <m:r>
-          <m:rPr>
-            <m:sty m:val="p"/>
-          </m:rPr>
-          <m:t>)</m:t>
-        </m:r>
-      </m:oMath>
-      <w:r>
-        <w:t xml:space="preserve"> </w:t>
-      </w:r>
-      <w:r>
-        <w:t xml:space="preserve">divas starpības ir nepāra. Pretruna, tātad nevar.</w:t>
-      </w:r>
-    </w:p>
-    <w:p>
-      <w:pPr>
-        <w:pStyle w:val="Compact"/>
-        <w:numPr>
-          <w:ilvl w:val="0"/>
-          <w:numId w:val="1003"/>
-        </w:numPr>
-      </w:pPr>
-      <w:r>
-        <w:rPr>
-          <w:i/>
-          <w:iCs/>
-        </w:rPr>
-        <w:t xml:space="preserve">Risināšana (B):</w:t>
-      </w:r>
-      <w:r>
-        <w:t xml:space="preserve"> </w:t>
-      </w:r>
-      <w:r>
-        <w:t xml:space="preserve">Paritātes</w:t>
-      </w:r>
-      <w:r>
-        <w:t xml:space="preserve"> </w:t>
-      </w:r>
-      <m:oMath>
-        <m:r>
-          <m:rPr>
-            <m:sty m:val="p"/>
-          </m:rPr>
-          <m:t>(</m:t>
-        </m:r>
-        <m:r>
-          <m:rPr>
-            <m:nor/>
-            <m:sty m:val="p"/>
-          </m:rPr>
-          <m:t>p</m:t>
-        </m:r>
-        <m:r>
-          <m:rPr>
-            <m:sty m:val="p"/>
-          </m:rPr>
-          <m:t>,</m:t>
-        </m:r>
-        <m:r>
-          <m:rPr>
-            <m:nor/>
-            <m:sty m:val="p"/>
-          </m:rPr>
-          <m:t>p</m:t>
-        </m:r>
-        <m:r>
-          <m:rPr>
-            <m:sty m:val="p"/>
-          </m:rPr>
-          <m:t>,</m:t>
-        </m:r>
-        <m:r>
-          <m:rPr>
-            <m:nor/>
-            <m:sty m:val="p"/>
-          </m:rPr>
-          <m:t>n</m:t>
-        </m:r>
-        <m:r>
-          <m:rPr>
-            <m:sty m:val="p"/>
-          </m:rPr>
-          <m:t>)</m:t>
-        </m:r>
-      </m:oMath>
-      <w:r>
-        <w:t xml:space="preserve"> </w:t>
-      </w:r>
-      <w:r>
-        <w:t xml:space="preserve">neizslēdz</w:t>
-      </w:r>
-      <w:r>
-        <w:t xml:space="preserve"> </w:t>
-      </w:r>
-      <w:r>
-        <w:t xml:space="preserve">rezultātu</w:t>
-      </w:r>
-      <w:r>
-        <w:t xml:space="preserve"> </w:t>
-      </w:r>
-      <m:oMath>
-        <m:r>
-          <m:rPr>
-            <m:sty m:val="p"/>
-          </m:rPr>
-          <m:t>(</m:t>
-        </m:r>
-        <m:r>
-          <m:t>0</m:t>
-        </m:r>
-        <m:r>
-          <m:rPr>
-            <m:sty m:val="p"/>
-          </m:rPr>
-          <m:t>,</m:t>
-        </m:r>
-        <m:r>
-          <m:t>0</m:t>
-        </m:r>
-        <m:r>
-          <m:rPr>
-            <m:sty m:val="p"/>
-          </m:rPr>
-          <m:t>,</m:t>
-        </m:r>
-        <m:r>
-          <m:t>1</m:t>
-        </m:r>
-        <m:r>
-          <m:rPr>
-            <m:sty m:val="p"/>
-          </m:rPr>
-          <m:t>)</m:t>
-        </m:r>
-      </m:oMath>
-      <w:r>
-        <w:t xml:space="preserve"> </w:t>
-      </w:r>
-      <w:r>
-        <w:t xml:space="preserve">— bet tas vēl nenozīmē, ka var! Jāuzrāda gājienu virkne:</w:t>
-      </w:r>
-      <w:r>
-        <w:t xml:space="preserve"> </w:t>
-      </w:r>
-      <w:r>
-        <w:t xml:space="preserve">trīs gājieni</w:t>
-      </w:r>
-      <w:r>
-        <w:t xml:space="preserve"> </w:t>
-      </w:r>
-      <w:r>
-        <w:rPr>
-          <w:i/>
-          <w:iCs/>
-        </w:rPr>
-        <w:t xml:space="preserve">bs</w:t>
-      </w:r>
-      <w:r>
-        <w:t xml:space="preserve">,</w:t>
-      </w:r>
-      <w:r>
-        <w:t xml:space="preserve"> </w:t>
-      </w:r>
-      <w:r>
-        <w:rPr>
-          <w:i/>
-          <w:iCs/>
-        </w:rPr>
-        <w:t xml:space="preserve">bz</w:t>
-      </w:r>
-      <w:r>
-        <w:t xml:space="preserve">,</w:t>
-      </w:r>
-      <w:r>
-        <w:t xml:space="preserve"> </w:t>
-      </w:r>
-      <w:r>
-        <w:rPr>
-          <w:i/>
-          <w:iCs/>
-        </w:rPr>
-        <w:t xml:space="preserve">sz</w:t>
-      </w:r>
-      <w:r>
-        <w:t xml:space="preserve"> </w:t>
-      </w:r>
-      <w:r>
-        <w:t xml:space="preserve">samazina visus trīs skaitus par</w:t>
-      </w:r>
-      <w:r>
-        <w:t xml:space="preserve"> </w:t>
-      </w:r>
-      <m:oMath>
-        <m:r>
-          <m:t>1</m:t>
-        </m:r>
-      </m:oMath>
-      <w:r>
-        <w:t xml:space="preserve">; ar tiem</w:t>
-      </w:r>
-      <w:r>
-        <w:t xml:space="preserve"> </w:t>
-      </w:r>
-      <w:r>
-        <w:t xml:space="preserve">nonāk pie</w:t>
-      </w:r>
-      <w:r>
-        <w:t xml:space="preserve"> </w:t>
-      </w:r>
-      <m:oMath>
-        <m:r>
-          <m:rPr>
-            <m:sty m:val="p"/>
-          </m:rPr>
-          <m:t>(</m:t>
-        </m:r>
-        <m:r>
-          <m:t>1</m:t>
-        </m:r>
-        <m:r>
-          <m:rPr>
-            <m:sty m:val="p"/>
-          </m:rPr>
-          <m:t>,</m:t>
-        </m:r>
-        <m:r>
-          <m:t>3</m:t>
-        </m:r>
-        <m:r>
-          <m:rPr>
-            <m:sty m:val="p"/>
-          </m:rPr>
-          <m:t>,</m:t>
-        </m:r>
-        <m:r>
-          <m:t>6</m:t>
-        </m:r>
-        <m:r>
-          <m:rPr>
-            <m:sty m:val="p"/>
-          </m:rPr>
-          <m:t>)</m:t>
-        </m:r>
-      </m:oMath>
-      <w:r>
-        <w:t xml:space="preserve"> </w:t>
-      </w:r>
-      <w:r>
-        <w:t xml:space="preserve">un tālāk pabeidz ar rokām.</w:t>
-      </w:r>
-    </w:p>
-    <w:p>
-      <w:pPr>
-        <w:pStyle w:val="Compact"/>
-        <w:numPr>
-          <w:ilvl w:val="0"/>
-          <w:numId w:val="1003"/>
-        </w:numPr>
-      </w:pPr>
-      <w:r>
-        <w:rPr>
-          <w:i/>
-          <w:iCs/>
-        </w:rPr>
-        <w:t xml:space="preserve">Atskats:</w:t>
-      </w:r>
-      <w:r>
-        <w:t xml:space="preserve"> </w:t>
-      </w:r>
-      <w:r>
-        <w:t xml:space="preserve">Formulē vienā teikumā, kāpēc invariants nekad nevar pierādīt</w:t>
-      </w:r>
-      <w:r>
-        <w:t xml:space="preserve"> </w:t>
-      </w:r>
-      <w:r>
-        <w:t xml:space="preserve">“jā”</w:t>
-      </w:r>
-      <w:r>
-        <w:t xml:space="preserve">.</w:t>
-      </w:r>
-    </w:p>
-    <w:bookmarkEnd w:id="9"/>
-    <w:bookmarkStart w:id="10" w:name="Xfaa772678a8f020bea03d01002c595672b0e114"/>
-    <w:p>
-      <w:pPr>
-        <w:pStyle w:val="Heading4"/>
-      </w:pPr>
-      <w:r>
-        <w:t xml:space="preserve">1.3. LV.AMO.2024.7.3 — invariants, kas nav pats skaitlis</w:t>
+        <w:t xml:space="preserve"> </w:t>
+      </w:r>
+      <w:r>
+        <w:t xml:space="preserve">taisnstūrim (LV.AMO.2015.8.2)?</w:t>
       </w:r>
     </w:p>
     <w:p>
@@ -1780,8 +909,7 @@
         </w:pBdr>
       </w:pPr>
     </w:p>
-    <w:bookmarkEnd w:id="10"/>
-    <w:bookmarkStart w:id="11" w:name="uzdevums"/>
+    <w:bookmarkStart w:id="15" w:name="uzdevums"/>
     <w:p>
       <w:pPr>
         <w:pStyle w:val="Heading2"/>
@@ -1790,8 +918,8 @@
         <w:t xml:space="preserve">1.uzdevums</w:t>
       </w:r>
     </w:p>
-    <w:bookmarkEnd w:id="11"/>
-    <w:bookmarkStart w:id="12" w:name="uzdevums-1"/>
+    <w:bookmarkEnd w:id="15"/>
+    <w:bookmarkStart w:id="16" w:name="uzdevums-1"/>
     <w:p>
       <w:pPr>
         <w:pStyle w:val="Heading2"/>
@@ -1800,11 +928,11 @@
         <w:t xml:space="preserve">2.uzdevums</w:t>
       </w:r>
     </w:p>
-    <w:bookmarkEnd w:id="12"/>
-    <w:bookmarkEnd w:id="13"/>
+    <w:bookmarkEnd w:id="16"/>
+    <w:bookmarkEnd w:id="17"/>
     <w:sectPr>
-      <w:headerReference w:type="default" r:id="rId9"/>
-      <w:footerReference w:type="default" r:id="rId10"/>
+      <w:headerReference w:type="default" r:id="rId10"/>
+      <w:footerReference w:type="default" r:id="rId11"/>
       <w:footnotePr>
         <w:numRestart w:val="eachSect"/>
       </w:footnotePr>
@@ -2064,9 +1192,6 @@
     <w:abstractNumId w:val="991"/>
   </w:num>
   <w:num w:numId="1002">
-    <w:abstractNumId w:val="991"/>
-  </w:num>
-  <w:num w:numId="1003">
     <w:abstractNumId w:val="991"/>
   </w:num>
 </w:numbering>

</xml_diff>